<commit_message>
Adding SQL-LLM benchmark info
</commit_message>
<xml_diff>
--- a/7-25 Summer Project.docx
+++ b/7-25 Summer Project.docx
@@ -199,7 +199,7 @@
     </w:p>
     <w:p>
       <w:r>
-        <w:t>Marketing, Engineering, and Data-related jobs tended to have higher salaries. Will confirm that is true with the actual dataset.</w:t>
+        <w:t xml:space="preserve">Marketing, Engineering, and Data-related jobs tended to have higher salaries. </w:t>
       </w:r>
     </w:p>
     <w:p>
@@ -219,23 +219,7 @@
           <w:b/>
           <w:bCs/>
         </w:rPr>
-        <w:t xml:space="preserve">I am giving you </w:t>
-      </w:r>
-      <w:proofErr w:type="gramStart"/>
-      <w:r>
-        <w:rPr>
-          <w:b/>
-          <w:bCs/>
-        </w:rPr>
-        <w:t>the</w:t>
-      </w:r>
-      <w:proofErr w:type="gramEnd"/>
-      <w:r>
-        <w:rPr>
-          <w:b/>
-          <w:bCs/>
-        </w:rPr>
-        <w:t xml:space="preserve"> short description of a job and its average salary in the thousands. Give me the broader job categories like wellness, software, consulting, engineer or the related </w:t>
+        <w:t xml:space="preserve">I am giving you the short description of a job and its average salary in the thousands. Give me the broader job categories like wellness, software, consulting, engineer or the related </w:t>
       </w:r>
       <w:proofErr w:type="gramStart"/>
       <w:r>
@@ -400,214 +384,804 @@
           <w:b/>
           <w:bCs/>
         </w:rPr>
-        <w:t xml:space="preserve">Now based on the job description, what job categories are </w:t>
+        <w:t>Now based on the job description, what job categories are most high paying? Please do not use NLP/tokenization but just use your own knowledge about job descriptions to do this analysis</w:t>
+      </w:r>
+    </w:p>
+    <w:p>
+      <w:pPr>
+        <w:pStyle w:val="ListParagraph"/>
+        <w:numPr>
+          <w:ilvl w:val="0"/>
+          <w:numId w:val="1"/>
+        </w:numPr>
+      </w:pPr>
+      <w:r>
+        <w:t xml:space="preserve">Determined what job categories were </w:t>
       </w:r>
       <w:proofErr w:type="gramStart"/>
       <w:r>
-        <w:rPr>
-          <w:b/>
-          <w:bCs/>
-        </w:rPr>
-        <w:t>most high</w:t>
+        <w:t>high-paying</w:t>
       </w:r>
       <w:proofErr w:type="gramEnd"/>
       <w:r>
-        <w:rPr>
-          <w:b/>
-          <w:bCs/>
-        </w:rPr>
-        <w:t xml:space="preserve"> paying? Please do not use NLP/tokenization but just use your own knowledge about job descriptions to do this analysis</w:t>
-      </w:r>
-    </w:p>
-    <w:p>
-      <w:pPr>
-        <w:pStyle w:val="ListParagraph"/>
-        <w:numPr>
-          <w:ilvl w:val="0"/>
-          <w:numId w:val="1"/>
-        </w:numPr>
-      </w:pPr>
-      <w:r>
-        <w:t xml:space="preserve">Determined what job categories were </w:t>
-      </w:r>
+        <w:t xml:space="preserve"> in general based on its own knowledge</w:t>
+      </w:r>
+    </w:p>
+    <w:p>
+      <w:pPr>
+        <w:pStyle w:val="ListParagraph"/>
+        <w:numPr>
+          <w:ilvl w:val="0"/>
+          <w:numId w:val="1"/>
+        </w:numPr>
+      </w:pPr>
+      <w:r>
+        <w:t xml:space="preserve">Created keywords for each category and looked through the job description for those keywords to categorize – these keywords were much more informative </w:t>
+      </w:r>
+      <w:r>
+        <w:t xml:space="preserve">than before </w:t>
+      </w:r>
+      <w:r>
+        <w:rPr>
+          <w:b/>
+          <w:bCs/>
+        </w:rPr>
+        <w:t>but still not that helpful</w:t>
+      </w:r>
+    </w:p>
+    <w:p>
+      <w:pPr>
+        <w:pStyle w:val="ListParagraph"/>
+        <w:numPr>
+          <w:ilvl w:val="0"/>
+          <w:numId w:val="1"/>
+        </w:numPr>
+      </w:pPr>
+      <w:r>
+        <w:t xml:space="preserve">Then took </w:t>
+      </w:r>
+      <w:r>
+        <w:t xml:space="preserve">the </w:t>
+      </w:r>
+      <w:r>
+        <w:t>average salary of each category</w:t>
+      </w:r>
+    </w:p>
+    <w:p/>
+    <w:p>
+      <w:r>
+        <w:t>Tried having GPT divide up videos based on view count into popular, not popular, and average, then gave it this prompt:</w:t>
+      </w:r>
+    </w:p>
+    <w:p>
+      <w:pPr>
+        <w:rPr>
+          <w:b/>
+          <w:bCs/>
+        </w:rPr>
+      </w:pPr>
+      <w:r>
+        <w:rPr>
+          <w:b/>
+          <w:bCs/>
+        </w:rPr>
+        <w:t>What video topics characterize the least popular, average, and popular categories? Please do not use NLP/tokenization but just use your knowledge about the video titles</w:t>
+      </w:r>
+    </w:p>
+    <w:p>
+      <w:pPr>
+        <w:pStyle w:val="ListParagraph"/>
+        <w:numPr>
+          <w:ilvl w:val="0"/>
+          <w:numId w:val="1"/>
+        </w:numPr>
+        <w:rPr>
+          <w:b/>
+          <w:bCs/>
+        </w:rPr>
+      </w:pPr>
+      <w:r>
+        <w:t>It just chose the first 5-10 titles from each category and used those to make its characterizations</w:t>
+      </w:r>
+    </w:p>
+    <w:p>
       <w:proofErr w:type="gramStart"/>
       <w:r>
-        <w:t>high-paying</w:t>
+        <w:t>So</w:t>
       </w:r>
       <w:proofErr w:type="gramEnd"/>
       <w:r>
-        <w:t xml:space="preserve"> in general based on its own knowledge</w:t>
-      </w:r>
-    </w:p>
-    <w:p>
-      <w:pPr>
-        <w:pStyle w:val="ListParagraph"/>
-        <w:numPr>
-          <w:ilvl w:val="0"/>
-          <w:numId w:val="1"/>
-        </w:numPr>
-      </w:pPr>
-      <w:r>
-        <w:t xml:space="preserve">Created keywords for each category and looked through the job description for those keywords to categorize – these keywords were much more informative </w:t>
-      </w:r>
-      <w:r>
-        <w:t xml:space="preserve">than before </w:t>
-      </w:r>
-      <w:r>
-        <w:rPr>
-          <w:b/>
-          <w:bCs/>
-        </w:rPr>
-        <w:t>but still not that helpful</w:t>
-      </w:r>
-    </w:p>
-    <w:p>
-      <w:pPr>
-        <w:pStyle w:val="ListParagraph"/>
-        <w:numPr>
-          <w:ilvl w:val="0"/>
-          <w:numId w:val="1"/>
-        </w:numPr>
-      </w:pPr>
-      <w:r>
-        <w:t xml:space="preserve">Then took </w:t>
-      </w:r>
-      <w:r>
-        <w:t xml:space="preserve">the </w:t>
-      </w:r>
-      <w:r>
-        <w:t>average salary of each category</w:t>
-      </w:r>
-    </w:p>
-    <w:p>
-      <w:pPr>
+        <w:t xml:space="preserve"> I broke things down by category:</w:t>
+      </w:r>
+    </w:p>
+    <w:p>
+      <w:pPr>
+        <w:rPr>
+          <w:b/>
+          <w:bCs/>
+        </w:rPr>
+      </w:pPr>
+      <w:r>
+        <w:rPr>
+          <w:b/>
+          <w:bCs/>
+        </w:rPr>
+        <w:t>Let's focus on the popular category. Please look at all the titles in this category (not using NLP/tokenization but just your knowledge about each title) and determine what topics are most popular.</w:t>
+      </w:r>
+    </w:p>
+    <w:p>
+      <w:pPr>
+        <w:pStyle w:val="ListParagraph"/>
+        <w:numPr>
+          <w:ilvl w:val="0"/>
+          <w:numId w:val="1"/>
+        </w:numPr>
+      </w:pPr>
+      <w:r>
+        <w:t>Did a much better job of determining what topics are popular overall with examples that generally made sense for all categories</w:t>
+      </w:r>
+    </w:p>
+    <w:p>
+      <w:pPr>
+        <w:pStyle w:val="ListParagraph"/>
+        <w:numPr>
+          <w:ilvl w:val="0"/>
+          <w:numId w:val="1"/>
+        </w:numPr>
+      </w:pPr>
+      <w:r>
+        <w:t>Was able to compare these categories to see what topics dominated each one, provided similarities and differences</w:t>
+      </w:r>
+    </w:p>
+    <w:p>
+      <w:r>
+        <w:lastRenderedPageBreak/>
+        <w:t>When switching to descriptions, it just looks at the top 5 or top 20 descriptions for each category rather than looking through all of them. Repeatedly prompting doesn’t help – maxes out at about 50 descriptions. Does a pretty good job of analyzing those 50 but ultimately not representative overall.</w:t>
+      </w:r>
+    </w:p>
+    <w:p>
+      <w:pPr>
+        <w:pStyle w:val="ListParagraph"/>
+        <w:numPr>
+          <w:ilvl w:val="0"/>
+          <w:numId w:val="1"/>
+        </w:numPr>
+      </w:pPr>
+      <w:r>
+        <w:t>Descriptions work w/ 100 samples (smaller sample size works better)</w:t>
+      </w:r>
+    </w:p>
+    <w:p>
+      <w:r>
+        <w:t>When I ask it to add a column with each new category to the spreadsheet, it once again goes back to the keywords. Some titles that it had previously grouped as one category when doing the free-form analysis are grouped as “other” because their title doesn’t contain the relevant keywords. The keywords are more relevant to the types of videos though.</w:t>
+      </w:r>
+    </w:p>
+    <w:p>
+      <w:pPr>
+        <w:rPr>
+          <w:b/>
+          <w:bCs/>
+        </w:rPr>
+      </w:pPr>
+      <w:r>
+        <w:rPr>
+          <w:b/>
+          <w:bCs/>
+        </w:rPr>
+        <w:t>O</w:t>
+      </w:r>
+      <w:r>
+        <w:rPr>
+          <w:b/>
+          <w:bCs/>
+        </w:rPr>
+        <w:t xml:space="preserve">kay, let's say you're looking at the original version of the dataset. what topics would you categorize each video as? please make a new column. do not use </w:t>
+      </w:r>
+      <w:proofErr w:type="spellStart"/>
+      <w:r>
+        <w:rPr>
+          <w:b/>
+          <w:bCs/>
+        </w:rPr>
+        <w:t>nlp</w:t>
+      </w:r>
+      <w:proofErr w:type="spellEnd"/>
+      <w:r>
+        <w:rPr>
+          <w:b/>
+          <w:bCs/>
+        </w:rPr>
+        <w:t xml:space="preserve"> or keywords just use your own knowledge for each video</w:t>
+      </w:r>
+    </w:p>
+    <w:p>
+      <w:r>
+        <w:t>Creates a switch function that only categorizes the first 5 videos, then leaves the rest as “other”!</w:t>
+      </w:r>
+    </w:p>
+    <w:p>
+      <w:r>
+        <w:t>Moving on to the jobs, this prompt correctly creates a title for each job based on its description (which wasn’t even happening before although the title is often in the description)</w:t>
+      </w:r>
+    </w:p>
+    <w:p>
+      <w:pPr>
+        <w:rPr>
+          <w:b/>
+          <w:bCs/>
+        </w:rPr>
+      </w:pPr>
+      <w:r>
+        <w:rPr>
+          <w:b/>
+          <w:bCs/>
+        </w:rPr>
+        <w:t>within this subset, please look at all the descriptions in the top 50 highest paying jobs and lowest 50 jobs (not using NLP/tokenization but just your knowledge about each description) and determine what jobs are most high paying.</w:t>
+      </w:r>
+    </w:p>
+    <w:p>
+      <w:pPr>
+        <w:pStyle w:val="ListParagraph"/>
+        <w:numPr>
+          <w:ilvl w:val="0"/>
+          <w:numId w:val="1"/>
+        </w:numPr>
+      </w:pPr>
+      <w:r>
+        <w:t>Lists out all titles, then groups them into relevant categories</w:t>
+      </w:r>
+    </w:p>
+    <w:p>
+      <w:pPr>
+        <w:rPr>
+          <w:b/>
+          <w:bCs/>
+        </w:rPr>
+      </w:pPr>
+      <w:r>
+        <w:rPr>
+          <w:b/>
+          <w:bCs/>
+        </w:rPr>
+        <w:t>Looking at the original dataset, please look at all the descriptions (not using NLP/tokenization but just your knowledge about each description) and determine what kinds of jobs are most high paying</w:t>
+      </w:r>
+    </w:p>
+    <w:p>
+      <w:pPr>
+        <w:pStyle w:val="ListParagraph"/>
+        <w:numPr>
+          <w:ilvl w:val="0"/>
+          <w:numId w:val="1"/>
+        </w:numPr>
+      </w:pPr>
+      <w:r>
+        <w:t>Once again goes back to keywords to categorize descriptions</w:t>
+      </w:r>
+      <w:r>
+        <w:t xml:space="preserve">, keywords are much </w:t>
+      </w:r>
+      <w:proofErr w:type="gramStart"/>
+      <w:r>
+        <w:t>more broad and useful</w:t>
+      </w:r>
+      <w:proofErr w:type="gramEnd"/>
+      <w:r>
+        <w:t xml:space="preserve"> perhaps because of the previous prompts</w:t>
+      </w:r>
+    </w:p>
+    <w:p>
+      <w:pPr>
+        <w:rPr>
+          <w:b/>
+          <w:bCs/>
+        </w:rPr>
+      </w:pPr>
+      <w:r>
+        <w:rPr>
+          <w:b/>
+          <w:bCs/>
+        </w:rPr>
+        <w:t>Is there a significant difference between the types of jobs in the higher paying versus lower paying jobs? Based on the description, do not use NLP/tokenization, just your knowledge</w:t>
+      </w:r>
+    </w:p>
+    <w:p>
+      <w:pPr>
+        <w:pStyle w:val="ListParagraph"/>
+        <w:numPr>
+          <w:ilvl w:val="0"/>
+          <w:numId w:val="1"/>
+        </w:numPr>
+      </w:pPr>
+      <w:r>
+        <w:t>Creates categories for higher paying versus lower paying jobs</w:t>
+      </w:r>
+    </w:p>
+    <w:p>
+      <w:pPr>
+        <w:pStyle w:val="ListParagraph"/>
+        <w:numPr>
+          <w:ilvl w:val="0"/>
+          <w:numId w:val="1"/>
+        </w:numPr>
+      </w:pPr>
+      <w:r>
+        <w:t xml:space="preserve">These categories don’t </w:t>
+      </w:r>
+      <w:r>
         <w:rPr>
           <w:i/>
           <w:iCs/>
         </w:rPr>
-      </w:pPr>
-      <w:r>
-        <w:rPr>
-          <w:i/>
-          <w:iCs/>
-        </w:rPr>
-        <w:t>--------------------- NOTES ------------------------</w:t>
-      </w:r>
-    </w:p>
-    <w:p>
-      <w:pPr>
-        <w:rPr>
-          <w:i/>
-          <w:iCs/>
-        </w:rPr>
-      </w:pPr>
-      <w:r>
-        <w:rPr>
-          <w:i/>
-          <w:iCs/>
-        </w:rPr>
-        <w:t>Potential o</w:t>
-      </w:r>
-      <w:r>
-        <w:rPr>
-          <w:i/>
-          <w:iCs/>
-        </w:rPr>
-        <w:t>verall process applied to something like video popularity:</w:t>
-      </w:r>
-    </w:p>
-    <w:p>
-      <w:pPr>
-        <w:pStyle w:val="ListParagraph"/>
-        <w:numPr>
-          <w:ilvl w:val="0"/>
-          <w:numId w:val="1"/>
-        </w:numPr>
-        <w:rPr>
-          <w:i/>
-          <w:iCs/>
-        </w:rPr>
-      </w:pPr>
-      <w:r>
-        <w:rPr>
-          <w:i/>
-          <w:iCs/>
-        </w:rPr>
-        <w:t xml:space="preserve">Go through the description and generate potential topics (there is already a method to do this using </w:t>
-      </w:r>
-      <w:r>
-        <w:rPr>
-          <w:i/>
-          <w:iCs/>
-        </w:rPr>
-        <w:t>LLMs</w:t>
-      </w:r>
-      <w:r>
-        <w:rPr>
-          <w:i/>
-          <w:iCs/>
-        </w:rPr>
-        <w:t>) in a schema using NLP</w:t>
-      </w:r>
-    </w:p>
-    <w:p>
-      <w:pPr>
-        <w:pStyle w:val="ListParagraph"/>
-        <w:numPr>
-          <w:ilvl w:val="0"/>
-          <w:numId w:val="1"/>
-        </w:numPr>
-        <w:rPr>
-          <w:i/>
-          <w:iCs/>
-        </w:rPr>
-      </w:pPr>
-      <w:r>
-        <w:rPr>
-          <w:i/>
-          <w:iCs/>
-        </w:rPr>
-        <w:t>Then group those topics by broader topic (i.e. “health,” “software”)</w:t>
-      </w:r>
-    </w:p>
-    <w:p>
-      <w:pPr>
-        <w:pStyle w:val="ListParagraph"/>
-        <w:numPr>
-          <w:ilvl w:val="0"/>
-          <w:numId w:val="1"/>
-        </w:numPr>
-        <w:rPr>
-          <w:i/>
-          <w:iCs/>
-        </w:rPr>
-      </w:pPr>
-      <w:r>
-        <w:rPr>
-          <w:i/>
-          <w:iCs/>
-        </w:rPr>
-        <w:t>If we’re looking at popularity, take the average popularity for each group and then choose the groups with the lowest numbers</w:t>
-      </w:r>
-    </w:p>
-    <w:p>
-      <w:pPr>
-        <w:pStyle w:val="ListParagraph"/>
-        <w:numPr>
-          <w:ilvl w:val="0"/>
-          <w:numId w:val="1"/>
-        </w:numPr>
-        <w:rPr>
-          <w:i/>
-          <w:iCs/>
-        </w:rPr>
-      </w:pPr>
-      <w:r>
-        <w:rPr>
-          <w:i/>
-          <w:iCs/>
-        </w:rPr>
-        <w:t>Alternatively, you could treat each broader topic as a categorical variable and perform regression</w:t>
+        <w:t xml:space="preserve">really </w:t>
+      </w:r>
+      <w:r>
+        <w:t>fit the jobs… for example, there are healthcare professionals in equal quantities in both high and low paying jobs but that isn’t correctly categorized by GPT</w:t>
+      </w:r>
+    </w:p>
+    <w:p>
+      <w:pPr>
+        <w:pStyle w:val="ListParagraph"/>
+        <w:numPr>
+          <w:ilvl w:val="1"/>
+          <w:numId w:val="1"/>
+        </w:numPr>
+      </w:pPr>
+      <w:r>
+        <w:t xml:space="preserve">Could be because there isn’t clear separation within this dataset </w:t>
+      </w:r>
+    </w:p>
+    <w:p>
+      <w:r>
+        <w:t>Overall goal:</w:t>
+      </w:r>
+    </w:p>
+    <w:p>
+      <w:pPr>
+        <w:pStyle w:val="ListParagraph"/>
+        <w:numPr>
+          <w:ilvl w:val="0"/>
+          <w:numId w:val="2"/>
+        </w:numPr>
+      </w:pPr>
+      <w:r>
+        <w:t xml:space="preserve">Determine what topics are most relevant to the most popular, least popular, and average videos. </w:t>
+      </w:r>
+    </w:p>
+    <w:p>
+      <w:pPr>
+        <w:pStyle w:val="ListParagraph"/>
+        <w:numPr>
+          <w:ilvl w:val="1"/>
+          <w:numId w:val="2"/>
+        </w:numPr>
+      </w:pPr>
+      <w:r>
+        <w:t xml:space="preserve">This works based on video title </w:t>
+      </w:r>
+      <w:r>
+        <w:rPr>
+          <mc:AlternateContent>
+            <mc:Choice Requires="w16se"/>
+            <mc:Fallback>
+              <w:rFonts w:ascii="Segoe UI Emoji" w:eastAsia="Segoe UI Emoji" w:hAnsi="Segoe UI Emoji" w:cs="Segoe UI Emoji"/>
+            </mc:Fallback>
+          </mc:AlternateContent>
+        </w:rPr>
+        <mc:AlternateContent>
+          <mc:Choice Requires="w16se">
+            <w16se:symEx w16se:font="Segoe UI Emoji" w16se:char="1F60A"/>
+          </mc:Choice>
+          <mc:Fallback>
+            <w:t>😊</w:t>
+          </mc:Fallback>
+        </mc:AlternateContent>
+      </w:r>
+    </w:p>
+    <w:p>
+      <w:pPr>
+        <w:pStyle w:val="ListParagraph"/>
+        <w:numPr>
+          <w:ilvl w:val="1"/>
+          <w:numId w:val="2"/>
+        </w:numPr>
+      </w:pPr>
+      <w:r>
+        <w:t xml:space="preserve">Does not work based on video description </w:t>
+      </w:r>
+      <w:r>
+        <w:t>for large sample sizes</w:t>
+      </w:r>
+      <w:r>
+        <w:rPr>
+          <mc:AlternateContent>
+            <mc:Choice Requires="w16se"/>
+            <mc:Fallback>
+              <w:rFonts w:ascii="Segoe UI Emoji" w:eastAsia="Segoe UI Emoji" w:hAnsi="Segoe UI Emoji" w:cs="Segoe UI Emoji"/>
+            </mc:Fallback>
+          </mc:AlternateContent>
+        </w:rPr>
+        <mc:AlternateContent>
+          <mc:Choice Requires="w16se">
+            <w16se:symEx w16se:font="Segoe UI Emoji" w16se:char="2639"/>
+          </mc:Choice>
+          <mc:Fallback>
+            <w:t>☹</w:t>
+          </mc:Fallback>
+        </mc:AlternateContent>
+      </w:r>
+      <w:r>
+        <w:t xml:space="preserve">but does work when I try it with a sample size of 100 </w:t>
+      </w:r>
+      <w:r>
+        <w:rPr>
+          <mc:AlternateContent>
+            <mc:Choice Requires="w16se"/>
+            <mc:Fallback>
+              <w:rFonts w:ascii="Segoe UI Emoji" w:eastAsia="Segoe UI Emoji" w:hAnsi="Segoe UI Emoji" w:cs="Segoe UI Emoji"/>
+            </mc:Fallback>
+          </mc:AlternateContent>
+        </w:rPr>
+        <mc:AlternateContent>
+          <mc:Choice Requires="w16se">
+            <w16se:symEx w16se:font="Segoe UI Emoji" w16se:char="1F60A"/>
+          </mc:Choice>
+          <mc:Fallback>
+            <w:t>😊</w:t>
+          </mc:Fallback>
+        </mc:AlternateContent>
+      </w:r>
+    </w:p>
+    <w:p>
+      <w:pPr>
+        <w:pStyle w:val="ListParagraph"/>
+        <w:numPr>
+          <w:ilvl w:val="0"/>
+          <w:numId w:val="2"/>
+        </w:numPr>
+      </w:pPr>
+      <w:r>
+        <w:t xml:space="preserve">To </w:t>
+      </w:r>
+      <w:proofErr w:type="gramStart"/>
+      <w:r>
+        <w:t>actually perform</w:t>
+      </w:r>
+      <w:proofErr w:type="gramEnd"/>
+      <w:r>
+        <w:t xml:space="preserve"> a statistical test for correlation:</w:t>
+      </w:r>
+    </w:p>
+    <w:p>
+      <w:pPr>
+        <w:pStyle w:val="ListParagraph"/>
+        <w:numPr>
+          <w:ilvl w:val="1"/>
+          <w:numId w:val="2"/>
+        </w:numPr>
+      </w:pPr>
+      <w:r>
+        <w:t>Categorize each video based on the topics generated in step 1</w:t>
+      </w:r>
+    </w:p>
+    <w:p>
+      <w:pPr>
+        <w:pStyle w:val="ListParagraph"/>
+        <w:numPr>
+          <w:ilvl w:val="2"/>
+          <w:numId w:val="2"/>
+        </w:numPr>
+      </w:pPr>
+      <w:r>
+        <w:lastRenderedPageBreak/>
+        <w:t xml:space="preserve">This does not work – LLM cannot categorize all videos </w:t>
+      </w:r>
+      <w:r>
+        <w:rPr>
+          <mc:AlternateContent>
+            <mc:Choice Requires="w16se"/>
+            <mc:Fallback>
+              <w:rFonts w:ascii="Segoe UI Emoji" w:eastAsia="Segoe UI Emoji" w:hAnsi="Segoe UI Emoji" w:cs="Segoe UI Emoji"/>
+            </mc:Fallback>
+          </mc:AlternateContent>
+        </w:rPr>
+        <mc:AlternateContent>
+          <mc:Choice Requires="w16se">
+            <w16se:symEx w16se:font="Segoe UI Emoji" w16se:char="2639"/>
+          </mc:Choice>
+          <mc:Fallback>
+            <w:t>☹</w:t>
+          </mc:Fallback>
+        </mc:AlternateContent>
+      </w:r>
+      <w:r>
+        <w:t xml:space="preserve">Need to break things down </w:t>
+      </w:r>
+    </w:p>
+    <w:p>
+      <w:pPr>
+        <w:pStyle w:val="ListParagraph"/>
+        <w:numPr>
+          <w:ilvl w:val="2"/>
+          <w:numId w:val="2"/>
+        </w:numPr>
+      </w:pPr>
+      <w:r>
+        <w:t xml:space="preserve">Trying to just categorize 100 videos also doesn’t work well – the categories are not accurate </w:t>
+      </w:r>
+      <w:r>
+        <w:rPr>
+          <mc:AlternateContent>
+            <mc:Choice Requires="w16se"/>
+            <mc:Fallback>
+              <w:rFonts w:ascii="Segoe UI Emoji" w:eastAsia="Segoe UI Emoji" w:hAnsi="Segoe UI Emoji" w:cs="Segoe UI Emoji"/>
+            </mc:Fallback>
+          </mc:AlternateContent>
+        </w:rPr>
+        <mc:AlternateContent>
+          <mc:Choice Requires="w16se">
+            <w16se:symEx w16se:font="Segoe UI Emoji" w16se:char="2639"/>
+          </mc:Choice>
+          <mc:Fallback>
+            <w:t>☹</w:t>
+          </mc:Fallback>
+        </mc:AlternateContent>
+      </w:r>
+    </w:p>
+    <w:p>
+      <w:pPr>
+        <w:pStyle w:val="ListParagraph"/>
+        <w:numPr>
+          <w:ilvl w:val="1"/>
+          <w:numId w:val="2"/>
+        </w:numPr>
+      </w:pPr>
+      <w:r>
+        <w:t>Determine whether the topics generated in step 1 are correlated to the most popular, least popular, and average categories through a chi-squared test</w:t>
+      </w:r>
+    </w:p>
+    <w:p>
+      <w:r>
+        <w:t xml:space="preserve">Overall: it seems determining most relevant topics to different categories works </w:t>
+      </w:r>
+      <w:proofErr w:type="gramStart"/>
+      <w:r>
+        <w:t>fairly well</w:t>
+      </w:r>
+      <w:proofErr w:type="gramEnd"/>
+      <w:r>
+        <w:t xml:space="preserve"> for GPT, especially when those categories are small enough for a “visual inspection.”</w:t>
+      </w:r>
+      <w:r>
+        <w:t xml:space="preserve"> This produces a general categorization that can give insight into trends/relationships. When asked to categorize these videos based on generated topics for actual statistical analysis, GPT struggles. </w:t>
+      </w:r>
+    </w:p>
+    <w:p/>
+    <w:p>
+      <w:r>
+        <w:t>Copilot exploration:</w:t>
+      </w:r>
+    </w:p>
+    <w:p>
+      <w:pPr>
+        <w:pStyle w:val="ListParagraph"/>
+        <w:numPr>
+          <w:ilvl w:val="0"/>
+          <w:numId w:val="1"/>
+        </w:numPr>
+      </w:pPr>
+      <w:r>
+        <w:t>Copilot comes up with categories that make sense given the data but in the case of the job categories it creates distinctions where there may not be any</w:t>
+      </w:r>
+    </w:p>
+    <w:p>
+      <w:pPr>
+        <w:pStyle w:val="ListParagraph"/>
+        <w:numPr>
+          <w:ilvl w:val="0"/>
+          <w:numId w:val="1"/>
+        </w:numPr>
+      </w:pPr>
+      <w:r>
+        <w:t>Does a better job of creating categories without explicit “no NLP” prompting</w:t>
+      </w:r>
+    </w:p>
+    <w:p>
+      <w:pPr>
+        <w:pStyle w:val="ListParagraph"/>
+        <w:numPr>
+          <w:ilvl w:val="0"/>
+          <w:numId w:val="1"/>
+        </w:numPr>
+      </w:pPr>
+      <w:r>
+        <w:t>But categories do not always make sense or could be hallucinated</w:t>
+      </w:r>
+    </w:p>
+    <w:p/>
+    <w:p>
+      <w:r>
+        <w:t>Prompt examples:</w:t>
+      </w:r>
+    </w:p>
+    <w:p>
+      <w:r>
+        <w:rPr>
+          <w:b/>
+          <w:bCs/>
+        </w:rPr>
+        <w:t>Just looking at the video titles, can you determine what video topics are highly correlated with popularity?</w:t>
+      </w:r>
+    </w:p>
+    <w:p>
+      <w:pPr>
+        <w:pStyle w:val="ListParagraph"/>
+        <w:numPr>
+          <w:ilvl w:val="0"/>
+          <w:numId w:val="1"/>
+        </w:numPr>
+      </w:pPr>
+      <w:r>
+        <w:t>Looks at descriptions and titles but overall creates relevant categories</w:t>
+      </w:r>
+    </w:p>
+    <w:p>
+      <w:pPr>
+        <w:pStyle w:val="ListParagraph"/>
+        <w:numPr>
+          <w:ilvl w:val="0"/>
+          <w:numId w:val="1"/>
+        </w:numPr>
+      </w:pPr>
+      <w:r>
+        <w:t>Categories aren’t necessarily from top 100-200 videos… tend to be on the higher side though</w:t>
+      </w:r>
+    </w:p>
+    <w:p>
+      <w:pPr>
+        <w:pStyle w:val="ListParagraph"/>
+        <w:numPr>
+          <w:ilvl w:val="0"/>
+          <w:numId w:val="1"/>
+        </w:numPr>
+      </w:pPr>
+      <w:r>
+        <w:t xml:space="preserve">Once again has trouble </w:t>
+      </w:r>
+      <w:proofErr w:type="gramStart"/>
+      <w:r>
+        <w:t>actually assigning</w:t>
+      </w:r>
+      <w:proofErr w:type="gramEnd"/>
+      <w:r>
+        <w:t xml:space="preserve"> each video a category</w:t>
+      </w:r>
+    </w:p>
+    <w:p>
+      <w:pPr>
+        <w:pStyle w:val="ListParagraph"/>
+        <w:numPr>
+          <w:ilvl w:val="0"/>
+          <w:numId w:val="1"/>
+        </w:numPr>
+      </w:pPr>
+      <w:r>
+        <w:t>Categories also change upon repeated prompting</w:t>
+      </w:r>
+    </w:p>
+    <w:p>
+      <w:pPr>
+        <w:rPr>
+          <w:b/>
+          <w:bCs/>
+        </w:rPr>
+      </w:pPr>
+      <w:r>
+        <w:rPr>
+          <w:b/>
+          <w:bCs/>
+        </w:rPr>
+        <w:t>Can you focus your analysis on the 100 most and 100 least popular videos based on view count? What topics are prevalent among these 200 videos and are there any differences or similarities you can find?</w:t>
+      </w:r>
+    </w:p>
+    <w:p>
+      <w:pPr>
+        <w:pStyle w:val="ListParagraph"/>
+        <w:numPr>
+          <w:ilvl w:val="0"/>
+          <w:numId w:val="1"/>
+        </w:numPr>
+      </w:pPr>
+      <w:r>
+        <w:t>Comes up with relevant categories but some categories seem underspecified</w:t>
+      </w:r>
+    </w:p>
+    <w:p>
+      <w:pPr>
+        <w:pStyle w:val="ListParagraph"/>
+        <w:numPr>
+          <w:ilvl w:val="1"/>
+          <w:numId w:val="1"/>
+        </w:numPr>
+      </w:pPr>
+      <w:r>
+        <w:t>Creates two categories “niche interests” and “technical and specialized content” that have the same video listed (its title in one and description in the other)</w:t>
+      </w:r>
+    </w:p>
+    <w:p/>
+    <w:p>
+      <w:r>
+        <w:t>Overall: much less prompt engineering involved and the way that Copilot seems to be approaching the problem makes sense (topic identification based on recurring themes or topics). But in both cases, it tends to arbitrarily create categories where the evidence might not be as strong.</w:t>
+      </w:r>
+    </w:p>
+    <w:p/>
+    <w:p>
+      <w:r>
+        <w:lastRenderedPageBreak/>
+        <w:t>Julius:</w:t>
+      </w:r>
+    </w:p>
+    <w:p>
+      <w:pPr>
+        <w:pStyle w:val="ListParagraph"/>
+        <w:numPr>
+          <w:ilvl w:val="0"/>
+          <w:numId w:val="1"/>
+        </w:numPr>
+      </w:pPr>
+      <w:r>
+        <w:t>Starts by using tokenization to find correlations</w:t>
+      </w:r>
+    </w:p>
+    <w:p>
+      <w:pPr>
+        <w:pStyle w:val="ListParagraph"/>
+        <w:numPr>
+          <w:ilvl w:val="0"/>
+          <w:numId w:val="1"/>
+        </w:numPr>
+      </w:pPr>
+      <w:r>
+        <w:t>Then when asked to find its own categories uses a keyword search that appears much more useful than GPT</w:t>
+      </w:r>
+    </w:p>
+    <w:p>
+      <w:pPr>
+        <w:pStyle w:val="ListParagraph"/>
+        <w:numPr>
+          <w:ilvl w:val="1"/>
+          <w:numId w:val="1"/>
+        </w:numPr>
+      </w:pPr>
+      <w:r>
+        <w:t>Then takes the average of each category and compares them to one another which makes sense</w:t>
+      </w:r>
+    </w:p>
+    <w:p>
+      <w:pPr>
+        <w:pStyle w:val="ListParagraph"/>
+        <w:numPr>
+          <w:ilvl w:val="1"/>
+          <w:numId w:val="1"/>
+        </w:numPr>
+      </w:pPr>
+      <w:r>
+        <w:t xml:space="preserve">But the actual videos under each category are horribly inaccurate: </w:t>
+      </w:r>
+      <w:proofErr w:type="gramStart"/>
+      <w:r>
+        <w:t>top</w:t>
+      </w:r>
+      <w:proofErr w:type="gramEnd"/>
+      <w:r>
+        <w:t xml:space="preserve"> 3 videos in News are all Avengers trailers!</w:t>
+      </w:r>
+    </w:p>
+    <w:p>
+      <w:r>
+        <w:t xml:space="preserve">Overall: </w:t>
+      </w:r>
+      <w:r>
+        <w:t>Seems unable to use its own “knowledge” to do any significant analysis and relies on pre-canned categories rather than deriving them from the data itself.</w:t>
       </w:r>
     </w:p>
     <w:sectPr>
@@ -623,6 +1197,95 @@
 <file path=word/numbering.xml><?xml version="1.0" encoding="utf-8"?>
 <w:numbering xmlns:wpc="http://schemas.microsoft.com/office/word/2010/wordprocessingCanvas" xmlns:cx="http://schemas.microsoft.com/office/drawing/2014/chartex" xmlns:cx1="http://schemas.microsoft.com/office/drawing/2015/9/8/chartex" xmlns:cx2="http://schemas.microsoft.com/office/drawing/2015/10/21/chartex" xmlns:cx3="http://schemas.microsoft.com/office/drawing/2016/5/9/chartex" xmlns:cx4="http://schemas.microsoft.com/office/drawing/2016/5/10/chartex" xmlns:cx5="http://schemas.microsoft.com/office/drawing/2016/5/11/chartex" xmlns:cx6="http://schemas.microsoft.com/office/drawing/2016/5/12/chartex" xmlns:cx7="http://schemas.microsoft.com/office/drawing/2016/5/13/chartex" xmlns:cx8="http://schemas.microsoft.com/office/drawing/2016/5/14/chartex" xmlns:mc="http://schemas.openxmlformats.org/markup-compatibility/2006" xmlns:aink="http://schemas.microsoft.com/office/drawing/2016/ink" xmlns:am3d="http://schemas.microsoft.com/office/drawing/2017/model3d" xmlns:o="urn:schemas-microsoft-com:office:office" xmlns:oel="http://schemas.microsoft.com/office/2019/extlst" xmlns:r="http://schemas.openxmlformats.org/officeDocument/2006/relationships" xmlns:m="http://schemas.openxmlformats.org/officeDocument/2006/math" xmlns:v="urn:schemas-microsoft-com:vml" xmlns:wp14="http://schemas.microsoft.com/office/word/2010/wordprocessingDrawing" xmlns:wp="http://schemas.openxmlformats.org/drawingml/2006/wordprocessingDrawing" xmlns:w10="urn:schemas-microsoft-com:office:word" xmlns:w="http://schemas.openxmlformats.org/wordprocessingml/2006/main" xmlns:w14="http://schemas.microsoft.com/office/word/2010/wordml" xmlns:w15="http://schemas.microsoft.com/office/word/2012/wordml" xmlns:w16cex="http://schemas.microsoft.com/office/word/2018/wordml/cex" xmlns:w16cid="http://schemas.microsoft.com/office/word/2016/wordml/cid" xmlns:w16="http://schemas.microsoft.com/office/word/2018/wordml" xmlns:w16du="http://schemas.microsoft.com/office/word/2023/wordml/word16du" xmlns:w16sdtdh="http://schemas.microsoft.com/office/word/2020/wordml/sdtdatahash" xmlns:w16se="http://schemas.microsoft.com/office/word/2015/wordml/symex" xmlns:wpg="http://schemas.microsoft.com/office/word/2010/wordprocessingGroup" xmlns:wpi="http://schemas.microsoft.com/office/word/2010/wordprocessingInk" xmlns:wne="http://schemas.microsoft.com/office/word/2006/wordml" xmlns:wps="http://schemas.microsoft.com/office/word/2010/wordprocessingShape" mc:Ignorable="w14 w15 w16se w16cid w16 w16cex w16sdtdh w16du wp14">
   <w:abstractNum w:abstractNumId="0" w15:restartNumberingAfterBreak="0">
+    <w:nsid w:val="21E32C59"/>
+    <w:multiLevelType w:val="hybridMultilevel"/>
+    <w:tmpl w:val="7CD4340E"/>
+    <w:lvl w:ilvl="0" w:tplc="0409000F">
+      <w:start w:val="1"/>
+      <w:numFmt w:val="decimal"/>
+      <w:lvlText w:val="%1."/>
+      <w:lvlJc w:val="left"/>
+      <w:pPr>
+        <w:ind w:left="720" w:hanging="360"/>
+      </w:pPr>
+      <w:rPr>
+        <w:rFonts w:hint="default"/>
+      </w:rPr>
+    </w:lvl>
+    <w:lvl w:ilvl="1" w:tplc="04090019">
+      <w:start w:val="1"/>
+      <w:numFmt w:val="lowerLetter"/>
+      <w:lvlText w:val="%2."/>
+      <w:lvlJc w:val="left"/>
+      <w:pPr>
+        <w:ind w:left="1440" w:hanging="360"/>
+      </w:pPr>
+    </w:lvl>
+    <w:lvl w:ilvl="2" w:tplc="0409001B">
+      <w:start w:val="1"/>
+      <w:numFmt w:val="lowerRoman"/>
+      <w:lvlText w:val="%3."/>
+      <w:lvlJc w:val="right"/>
+      <w:pPr>
+        <w:ind w:left="2160" w:hanging="180"/>
+      </w:pPr>
+    </w:lvl>
+    <w:lvl w:ilvl="3" w:tplc="0409000F" w:tentative="1">
+      <w:start w:val="1"/>
+      <w:numFmt w:val="decimal"/>
+      <w:lvlText w:val="%4."/>
+      <w:lvlJc w:val="left"/>
+      <w:pPr>
+        <w:ind w:left="2880" w:hanging="360"/>
+      </w:pPr>
+    </w:lvl>
+    <w:lvl w:ilvl="4" w:tplc="04090019" w:tentative="1">
+      <w:start w:val="1"/>
+      <w:numFmt w:val="lowerLetter"/>
+      <w:lvlText w:val="%5."/>
+      <w:lvlJc w:val="left"/>
+      <w:pPr>
+        <w:ind w:left="3600" w:hanging="360"/>
+      </w:pPr>
+    </w:lvl>
+    <w:lvl w:ilvl="5" w:tplc="0409001B" w:tentative="1">
+      <w:start w:val="1"/>
+      <w:numFmt w:val="lowerRoman"/>
+      <w:lvlText w:val="%6."/>
+      <w:lvlJc w:val="right"/>
+      <w:pPr>
+        <w:ind w:left="4320" w:hanging="180"/>
+      </w:pPr>
+    </w:lvl>
+    <w:lvl w:ilvl="6" w:tplc="0409000F" w:tentative="1">
+      <w:start w:val="1"/>
+      <w:numFmt w:val="decimal"/>
+      <w:lvlText w:val="%7."/>
+      <w:lvlJc w:val="left"/>
+      <w:pPr>
+        <w:ind w:left="5040" w:hanging="360"/>
+      </w:pPr>
+    </w:lvl>
+    <w:lvl w:ilvl="7" w:tplc="04090019" w:tentative="1">
+      <w:start w:val="1"/>
+      <w:numFmt w:val="lowerLetter"/>
+      <w:lvlText w:val="%8."/>
+      <w:lvlJc w:val="left"/>
+      <w:pPr>
+        <w:ind w:left="5760" w:hanging="360"/>
+      </w:pPr>
+    </w:lvl>
+    <w:lvl w:ilvl="8" w:tplc="0409001B" w:tentative="1">
+      <w:start w:val="1"/>
+      <w:numFmt w:val="lowerRoman"/>
+      <w:lvlText w:val="%9."/>
+      <w:lvlJc w:val="right"/>
+      <w:pPr>
+        <w:ind w:left="6480" w:hanging="180"/>
+      </w:pPr>
+    </w:lvl>
+  </w:abstractNum>
+  <w:abstractNum w:abstractNumId="1" w15:restartNumberingAfterBreak="0">
     <w:nsid w:val="4A1E1D2E"/>
     <w:multiLevelType w:val="hybridMultilevel"/>
     <w:tmpl w:val="CBDAF24E"/>
@@ -637,7 +1300,7 @@
         <w:rFonts w:ascii="Aptos" w:eastAsiaTheme="minorHAnsi" w:hAnsi="Aptos" w:cstheme="minorBidi" w:hint="default"/>
       </w:rPr>
     </w:lvl>
-    <w:lvl w:ilvl="1" w:tplc="04090003" w:tentative="1">
+    <w:lvl w:ilvl="1" w:tplc="04090003">
       <w:start w:val="1"/>
       <w:numFmt w:val="bullet"/>
       <w:lvlText w:val="o"/>
@@ -735,6 +1398,9 @@
     </w:lvl>
   </w:abstractNum>
   <w:num w:numId="1" w16cid:durableId="58285476">
+    <w:abstractNumId w:val="1"/>
+  </w:num>
+  <w:num w:numId="2" w16cid:durableId="1293098230">
     <w:abstractNumId w:val="0"/>
   </w:num>
 </w:numbering>

</xml_diff>